<commit_message>
Part-3: test reports, Test Plan v1.2, Test Summary Report v1.1
- docs/reports/: Unit Test, System Validation, Code Coverage and Branch
  Coverage reports (.docx) plus raw JUnit/coverage data and HTML coverage.
- TestPlan v1.2: Appendix A steps/expected results updated to match the
  implemented tests; schedule and deliverables list the Part-3 work.
- TestSummaryReport v1.1: 113 tests, 100% line and branch coverage, 40 CI runs.
- README: report links and status numbers.

Co-Authored-By: Claude Sonnet 5.5 <noreply@anthropic.com>
Claude-Session: https://claude.ai/code/session_015cNS3uUaQqfmoU3tCXxqgq
</commit_message>
<xml_diff>
--- a/docs/TestPlan_SmartParking.docx
+++ b/docs/TestPlan_SmartParking.docx
@@ -57,7 +57,7 @@
         <w:rPr>
           <w:rFonts w:ascii="Arial" w:cs="Arial" w:eastAsia="Arial" w:hAnsi="Arial"/>
         </w:rPr>
-        <w:t xml:space="preserve">1.1</w:t>
+        <w:t>1.2</w:t>
       </w:r>
     </w:p>
     <w:p>
@@ -95,7 +95,7 @@
         <w:rPr>
           <w:rFonts w:ascii="Arial" w:cs="Arial" w:eastAsia="Arial" w:hAnsi="Arial"/>
         </w:rPr>
-        <w:t xml:space="preserve">10-10-2026</w:t>
+        <w:t>29-10-2026</w:t>
       </w:r>
     </w:p>
     <w:p>
@@ -115,6 +115,25 @@
           <w:rFonts w:ascii="Arial" w:cs="Arial" w:eastAsia="Arial" w:hAnsi="Arial"/>
         </w:rPr>
         <w:t xml:space="preserve">Draft</w:t>
+      </w:r>
+    </w:p>
+    <w:p>
+      <w:pPr>
+        <w:spacing w:after="40"/>
+      </w:pPr>
+      <w:r>
+        <w:rPr>
+          <w:rFonts w:ascii="Arial" w:cs="Arial" w:eastAsia="Arial" w:hAnsi="Arial"/>
+          <w:b/>
+          <w:bCs/>
+        </w:rPr>
+        <w:t xml:space="preserve">Revision 1.2: </w:t>
+      </w:r>
+      <w:r>
+        <w:rPr>
+          <w:rFonts w:ascii="Arial" w:cs="Arial" w:eastAsia="Arial" w:hAnsi="Arial"/>
+        </w:rPr>
+        <w:t>Part-3 update (29-10-2026). Appendix A steps and expected results now match the implemented tests; sections 7 and 8 record the Part-3 test reports. Version 1.1 (10-10-2026) is unchanged otherwise.</w:t>
       </w:r>
     </w:p>
     <w:p>
@@ -4889,6 +4908,184 @@
                 <w:sz w:val="17"/>
                 <w:szCs w:val="17"/>
               </w:rPr>
+              <w:t>Part-3: test cases updated; Unit Test, System Validation, Code Coverage and Branch Coverage reports</w:t>
+            </w:r>
+          </w:p>
+        </w:tc>
+        <w:tc>
+          <w:tcPr>
+            <w:tcW w:type="dxa" w:w="1700"/>
+            <w:tcBorders>
+              <w:top w:val="single" w:color="8EA9C8" w:sz="4"/>
+              <w:left w:val="single" w:color="8EA9C8" w:sz="4"/>
+              <w:bottom w:val="single" w:color="8EA9C8" w:sz="4"/>
+              <w:right w:val="single" w:color="8EA9C8" w:sz="4"/>
+            </w:tcBorders>
+            <w:tcMar>
+              <w:top w:type="dxa" w:w="50"/>
+              <w:left w:type="dxa" w:w="90"/>
+              <w:bottom w:type="dxa" w:w="50"/>
+              <w:right w:type="dxa" w:w="90"/>
+            </w:tcMar>
+          </w:tcPr>
+          <w:p>
+            <w:r>
+              <w:rPr>
+                <w:rFonts w:ascii="Arial" w:cs="Arial" w:eastAsia="Arial" w:hAnsi="Arial"/>
+                <w:b w:val="false"/>
+                <w:bCs w:val="false"/>
+                <w:sz w:val="17"/>
+                <w:szCs w:val="17"/>
+              </w:rPr>
+              <w:t>02-Nov-2026 to 06-Nov-2026</w:t>
+            </w:r>
+          </w:p>
+        </w:tc>
+        <w:tc>
+          <w:tcPr>
+            <w:tcW w:type="dxa" w:w="2500"/>
+            <w:tcBorders>
+              <w:top w:val="single" w:color="8EA9C8" w:sz="4"/>
+              <w:left w:val="single" w:color="8EA9C8" w:sz="4"/>
+              <w:bottom w:val="single" w:color="8EA9C8" w:sz="4"/>
+              <w:right w:val="single" w:color="8EA9C8" w:sz="4"/>
+            </w:tcBorders>
+            <w:tcMar>
+              <w:top w:type="dxa" w:w="50"/>
+              <w:left w:type="dxa" w:w="90"/>
+              <w:bottom w:type="dxa" w:w="50"/>
+              <w:right w:type="dxa" w:w="90"/>
+            </w:tcMar>
+          </w:tcPr>
+          <w:p>
+            <w:r>
+              <w:rPr>
+                <w:rFonts w:ascii="Arial" w:cs="Arial" w:eastAsia="Arial" w:hAnsi="Arial"/>
+                <w:b w:val="false"/>
+                <w:bCs w:val="false"/>
+                <w:sz w:val="17"/>
+                <w:szCs w:val="17"/>
+              </w:rPr>
+              <w:t>29-Oct-2026 — done (docs/reports/)</w:t>
+            </w:r>
+          </w:p>
+        </w:tc>
+      </w:tr>
+      <w:tr>
+        <w:tc>
+          <w:tcPr>
+            <w:tcW w:type="dxa" w:w="4826"/>
+            <w:tcBorders>
+              <w:top w:val="single" w:color="8EA9C8" w:sz="4"/>
+              <w:left w:val="single" w:color="8EA9C8" w:sz="4"/>
+              <w:bottom w:val="single" w:color="8EA9C8" w:sz="4"/>
+              <w:right w:val="single" w:color="8EA9C8" w:sz="4"/>
+            </w:tcBorders>
+            <w:tcMar>
+              <w:top w:type="dxa" w:w="50"/>
+              <w:left w:type="dxa" w:w="90"/>
+              <w:bottom w:type="dxa" w:w="50"/>
+              <w:right w:type="dxa" w:w="90"/>
+            </w:tcMar>
+          </w:tcPr>
+          <w:p>
+            <w:r>
+              <w:rPr>
+                <w:rFonts w:ascii="Arial" w:cs="Arial" w:eastAsia="Arial" w:hAnsi="Arial"/>
+                <w:b w:val="false"/>
+                <w:bCs w:val="false"/>
+                <w:sz w:val="17"/>
+                <w:szCs w:val="17"/>
+              </w:rPr>
+              <w:t>Windows run (TC-PORT-01) and manual console walkthrough (TC-UX-01)</w:t>
+            </w:r>
+          </w:p>
+        </w:tc>
+        <w:tc>
+          <w:tcPr>
+            <w:tcW w:type="dxa" w:w="1700"/>
+            <w:tcBorders>
+              <w:top w:val="single" w:color="8EA9C8" w:sz="4"/>
+              <w:left w:val="single" w:color="8EA9C8" w:sz="4"/>
+              <w:bottom w:val="single" w:color="8EA9C8" w:sz="4"/>
+              <w:right w:val="single" w:color="8EA9C8" w:sz="4"/>
+            </w:tcBorders>
+            <w:tcMar>
+              <w:top w:type="dxa" w:w="50"/>
+              <w:left w:type="dxa" w:w="90"/>
+              <w:bottom w:type="dxa" w:w="50"/>
+              <w:right w:type="dxa" w:w="90"/>
+            </w:tcMar>
+          </w:tcPr>
+          <w:p>
+            <w:r>
+              <w:rPr>
+                <w:rFonts w:ascii="Arial" w:cs="Arial" w:eastAsia="Arial" w:hAnsi="Arial"/>
+                <w:b w:val="false"/>
+                <w:bCs w:val="false"/>
+                <w:sz w:val="17"/>
+                <w:szCs w:val="17"/>
+              </w:rPr>
+              <w:t>02-Nov-2026 to 06-Nov-2026</w:t>
+            </w:r>
+          </w:p>
+        </w:tc>
+        <w:tc>
+          <w:tcPr>
+            <w:tcW w:type="dxa" w:w="2500"/>
+            <w:tcBorders>
+              <w:top w:val="single" w:color="8EA9C8" w:sz="4"/>
+              <w:left w:val="single" w:color="8EA9C8" w:sz="4"/>
+              <w:bottom w:val="single" w:color="8EA9C8" w:sz="4"/>
+              <w:right w:val="single" w:color="8EA9C8" w:sz="4"/>
+            </w:tcBorders>
+            <w:tcMar>
+              <w:top w:type="dxa" w:w="50"/>
+              <w:left w:type="dxa" w:w="90"/>
+              <w:bottom w:type="dxa" w:w="50"/>
+              <w:right w:type="dxa" w:w="90"/>
+            </w:tcMar>
+          </w:tcPr>
+          <w:p>
+            <w:r>
+              <w:rPr>
+                <w:rFonts w:ascii="Arial" w:cs="Arial" w:eastAsia="Arial" w:hAnsi="Arial"/>
+                <w:b w:val="false"/>
+                <w:bCs w:val="false"/>
+                <w:sz w:val="17"/>
+                <w:szCs w:val="17"/>
+              </w:rPr>
+              <w:t>Pending</w:t>
+            </w:r>
+          </w:p>
+        </w:tc>
+      </w:tr>
+      <w:tr>
+        <w:tc>
+          <w:tcPr>
+            <w:tcW w:type="dxa" w:w="4826"/>
+            <w:tcBorders>
+              <w:top w:val="single" w:color="8EA9C8" w:sz="4"/>
+              <w:left w:val="single" w:color="8EA9C8" w:sz="4"/>
+              <w:bottom w:val="single" w:color="8EA9C8" w:sz="4"/>
+              <w:right w:val="single" w:color="8EA9C8" w:sz="4"/>
+            </w:tcBorders>
+            <w:tcMar>
+              <w:top w:type="dxa" w:w="50"/>
+              <w:left w:type="dxa" w:w="90"/>
+              <w:bottom w:type="dxa" w:w="50"/>
+              <w:right w:type="dxa" w:w="90"/>
+            </w:tcMar>
+          </w:tcPr>
+          <w:p>
+            <w:r>
+              <w:rPr>
+                <w:rFonts w:ascii="Arial" w:cs="Arial" w:eastAsia="Arial" w:hAnsi="Arial"/>
+                <w:b w:val="false"/>
+                <w:bCs w:val="false"/>
+                <w:sz w:val="17"/>
+                <w:szCs w:val="17"/>
+              </w:rPr>
               <w:t xml:space="preserve">UAT walkthrough and sign-off</w:t>
             </w:r>
           </w:p>
@@ -5074,6 +5271,22 @@
           <w:rFonts w:ascii="Arial" w:cs="Arial" w:eastAsia="Arial" w:hAnsi="Arial"/>
         </w:rPr>
         <w:t xml:space="preserve">Test Summary Report</w:t>
+      </w:r>
+    </w:p>
+    <w:p>
+      <w:pPr>
+        <w:pStyle w:val="ListParagraph"/>
+        <w:numPr>
+          <w:ilvl w:val="0"/>
+          <w:numId w:val="2"/>
+        </w:numPr>
+        <w:spacing w:after="40"/>
+      </w:pPr>
+      <w:r>
+        <w:rPr>
+          <w:rFonts w:ascii="Arial" w:cs="Arial" w:eastAsia="Arial" w:hAnsi="Arial"/>
+        </w:rPr>
+        <w:t>Unit Test, System Validation, Code Coverage and Branch Coverage Reports (docs/reports/)</w:t>
       </w:r>
     </w:p>
     <w:p>
@@ -7330,7 +7543,7 @@
                 <w:sz w:val="15"/>
                 <w:szCs w:val="15"/>
               </w:rPr>
-              <w:t xml:space="preserve">Read occupancy; occupy L0-C1, reserve L0-C2; read again</w:t>
+              <w:t>Read occupancy; occupy L0-C1, reserve L0-C2; read again; call free_slots()</w:t>
             </w:r>
           </w:p>
         </w:tc>
@@ -7359,7 +7572,7 @@
                 <w:sz w:val="15"/>
                 <w:szCs w:val="15"/>
               </w:rPr>
-              <w:t xml:space="preserve">First: 10 available. Second: occupied 1, reserved 1, available 8</w:t>
+              <w:t>First: 10 available. Second: occupied 1, reserved 1, available 8; free_slots() lists only the 8 slots that are neither occupied nor reserved</w:t>
             </w:r>
           </w:p>
         </w:tc>
@@ -8150,7 +8363,7 @@
                 <w:sz w:val="15"/>
                 <w:szCs w:val="15"/>
               </w:rPr>
-              <w:t xml:space="preserve">find_slot for SUV</w:t>
+              <w:t>find_slot for SUV; require_slot for SUV; repeat on a lot that has no large slots</w:t>
             </w:r>
           </w:p>
         </w:tc>
@@ -8179,7 +8392,7 @@
                 <w:sz w:val="15"/>
                 <w:szCs w:val="15"/>
               </w:rPr>
-              <w:t xml:space="preserve">Returns None / lot-full; no slot state changes</w:t>
+              <w:t>find_slot returns None; require_slot raises LotFullError naming the vehicle type and slot counts (or that the lot has no such slots); no slot state changes</w:t>
             </w:r>
           </w:p>
         </w:tc>
@@ -8970,7 +9183,7 @@
                 <w:sz w:val="15"/>
                 <w:szCs w:val="15"/>
               </w:rPr>
-              <w:t xml:space="preserve">vehicle_exit unpaid; pay; vehicle_exit again</w:t>
+              <w:t>vehicle_exit unpaid; pay; vehicle_exit again; exit inside the 15-min grace period; exit with unknown or already closed ticket; exit when the slot now holds another plate; ticket without a vehicle type</w:t>
             </w:r>
           </w:p>
         </w:tc>
@@ -8999,7 +9212,7 @@
                 <w:sz w:val="15"/>
                 <w:szCs w:val="15"/>
               </w:rPr>
-              <w:t xml:space="preserve">First: UnpaidTicketError. Second: slot free, exit_time set</w:t>
+              <w:t>First: UnpaidTicketError. Second: slot free, exit_time set. Grace period: exit without payment. Unknown or closed ticket: ParkingError. Another plate's slot is not freed. Stored amount_due is used when the vehicle type is missing</w:t>
             </w:r>
           </w:p>
         </w:tc>
@@ -9380,7 +9593,7 @@
                 <w:sz w:val="15"/>
                 <w:szCs w:val="15"/>
               </w:rPr>
-              <w:t xml:space="preserve">cancel(R1); cancel(R1)</w:t>
+              <w:t>cancel(R1); cancel(R1); cancel('unknown'); cancel when the slot is already held by another reservation</w:t>
             </w:r>
           </w:p>
         </w:tc>
@@ -9409,7 +9622,7 @@
                 <w:sz w:val="15"/>
                 <w:szCs w:val="15"/>
               </w:rPr>
-              <w:t xml:space="preserve">Slot free, status CANCELLED; second cancel rejected</w:t>
+              <w:t>Slot free, status CANCELLED; second cancel and unknown id rejected; the other reservation's hold is not released</w:t>
             </w:r>
           </w:p>
         </w:tc>
@@ -9585,7 +9798,7 @@
                 <w:sz w:val="15"/>
                 <w:szCs w:val="15"/>
               </w:rPr>
-              <w:t xml:space="preserve">expire_no_shows at T+14 min, then T+16 min</w:t>
+              <w:t>expire_no_shows at T+14, T+15 and T+16 min; cancelled reservations; future reservations; slot held by another reservation</w:t>
             </w:r>
           </w:p>
         </w:tc>
@@ -9614,7 +9827,7 @@
                 <w:sz w:val="15"/>
                 <w:szCs w:val="15"/>
               </w:rPr>
-              <w:t xml:space="preserve">Still ACTIVE at +14; EXPIRED and slot freed at +16</w:t>
+              <w:t>ACTIVE at +14 and +15; EXPIRED and slot freed at +16; only ACTIVE reservations expire; another reservation's hold is not released</w:t>
             </w:r>
           </w:p>
         </w:tc>
@@ -9790,7 +10003,7 @@
                 <w:sz w:val="15"/>
                 <w:szCs w:val="15"/>
               </w:rPr>
-              <w:t xml:space="preserve">check_in(R1); check_in('unknown')</w:t>
+              <w:t>check_in(R1); check_in('unknown'); check_in a used reservation; check_in more than 15 min late; plate already parked; slot held by another reservation</w:t>
             </w:r>
           </w:p>
         </w:tc>
@@ -9819,7 +10032,7 @@
                 <w:sz w:val="15"/>
                 <w:szCs w:val="15"/>
               </w:rPr>
-              <w:t xml:space="preserve">Ticket for held slot, status USED; unknown id rejected</w:t>
+              <w:t>Ticket for held slot, status USED; unknown or used id rejected; late check-in expires the reservation and raises; plate already inside rejected</w:t>
             </w:r>
           </w:p>
         </w:tc>
@@ -9995,7 +10208,7 @@
                 <w:sz w:val="15"/>
                 <w:szCs w:val="15"/>
               </w:rPr>
-              <w:t xml:space="preserve">Fees for 10 min, 61 min, 10 h; bike 2 h; SUV 3 h</w:t>
+              <w:t>Fees for a car at 10, 15, 16 and 61 min, 10 h, 24 h and 26 h; bike 2 h; SUV 3 h; exit before entry</w:t>
             </w:r>
           </w:p>
         </w:tc>
@@ -10024,7 +10237,7 @@
                 <w:sz w:val="15"/>
                 <w:szCs w:val="15"/>
               </w:rPr>
-              <w:t xml:space="preserve">₹0, ₹60, ₹240 (cap), ₹20, ₹120</w:t>
+              <w:t>Rs 0 (10, 15 min), Rs 30 (16 min), Rs 60 (61 min), Rs 240 (10 h and 24 h, daily cap), Rs 300 (26 h), bike Rs 20, SUV Rs 120; exit before entry raises ValueError</w:t>
             </w:r>
           </w:p>
         </w:tc>
@@ -10200,7 +10413,7 @@
                 <w:sz w:val="15"/>
                 <w:szCs w:val="15"/>
               </w:rPr>
-              <w:t xml:space="preserve">Pay ₹50; pay ₹60 with declining gateway; pay ₹60</w:t>
+              <w:t>Pay Rs 50; pay Rs 60 with a declining gateway; pay Rs 60; pay again; pay zero, negative, text and None</w:t>
             </w:r>
           </w:p>
         </w:tc>
@@ -10229,7 +10442,7 @@
                 <w:sz w:val="15"/>
                 <w:szCs w:val="15"/>
               </w:rPr>
-              <w:t xml:space="preserve">PaymentError; still unpaid; paid = True</w:t>
+              <w:t>Wrong amount: PaymentError, gateway not charged. Declined: PaymentError, ticket unpaid. Exact amount: paid = True. Second payment and zero due rejected. Negative, text and None rejected</w:t>
             </w:r>
           </w:p>
         </w:tc>
@@ -10405,7 +10618,7 @@
                 <w:sz w:val="15"/>
                 <w:szCs w:val="15"/>
               </w:rPr>
-              <w:t xml:space="preserve">receipt(ticket, payment); receipt for unpaid ticket</w:t>
+              <w:t>receipt(ticket, payment) after exit; receipt before exit; receipt for unpaid ticket; receipt with another ticket's payment</w:t>
             </w:r>
           </w:p>
         </w:tc>
@@ -10434,7 +10647,7 @@
                 <w:sz w:val="15"/>
                 <w:szCs w:val="15"/>
               </w:rPr>
-              <w:t xml:space="preserve">Contains id, plate, times, duration, amount, ref; unpaid rejected</w:t>
+              <w:t>Contains id, plate, slot, times, duration, amount, method and ref; duration uses payment time if the car has not exited; unpaid ticket and mismatched payment rejected</w:t>
             </w:r>
           </w:p>
         </w:tc>
@@ -10610,7 +10823,7 @@
                 <w:sz w:val="15"/>
                 <w:szCs w:val="15"/>
               </w:rPr>
-              <w:t xml:space="preserve">occupancy_by_level_and_type</w:t>
+              <w:t>occupancy_by_level_and_type on the demo lot (2 levels, 3 slot types), on a lot with occupied and reserved slots, and on an empty lot</w:t>
             </w:r>
           </w:p>
         </w:tc>
@@ -10639,7 +10852,7 @@
                 <w:sz w:val="15"/>
                 <w:szCs w:val="15"/>
               </w:rPr>
-              <w:t xml:space="preserve">Entry for each level × type; sums equal lot totals</w:t>
+              <w:t>Entry for each level x type; counts match slot states; sums equal lot totals; empty lot gives an empty report</w:t>
             </w:r>
           </w:p>
         </w:tc>
@@ -12045,7 +12258,7 @@
                 <w:sz w:val="15"/>
                 <w:szCs w:val="15"/>
               </w:rPr>
-              <w:t xml:space="preserve">Perform entry; trigger each error</w:t>
+              <w:t>Perform an entry; trigger each error (bad plate, bad type, duplicate, unknown ticket or reservation, non-numeric amount, bad menu choice); run a full visit, reserve / cancel / check-in, no-show expiry; start via main() and python -m smart_parking.main</w:t>
             </w:r>
           </w:p>
         </w:tc>
@@ -12074,7 +12287,7 @@
                 <w:sz w:val="15"/>
                 <w:szCs w:val="15"/>
               </w:rPr>
-              <w:t xml:space="preserve">Entry in ≤ 3 interactions; each error is a readable message</w:t>
+              <w:t>Entry in 3 answers; each error is a readable message and the console keeps running; every menu action works; the program starts and quits cleanly</w:t>
             </w:r>
           </w:p>
         </w:tc>
@@ -13609,7 +13822,7 @@
         <w:sz w:val="16"/>
         <w:szCs w:val="16"/>
       </w:rPr>
-      <w:t xml:space="preserve">SPMS — Software Test Plan v1.1  |  Page </w:t>
+      <w:t xml:space="preserve">SPMS — Software Test Plan v1.2  |  Page </w:t>
     </w:r>
     <w:r>
       <w:rPr>

</xml_diff>